<commit_message>
Update fix bug circuit
</commit_message>
<xml_diff>
--- a/lab5/lab05.docx
+++ b/lab5/lab05.docx
@@ -790,36 +790,44 @@
           <w:szCs w:val="32"/>
           <w:cs/>
         </w:rPr>
-        <w:t>การออกแบบ</w:t>
-      </w:r>
-      <w:r>
+        <w:t xml:space="preserve">การออกแบบวงจร </w:t>
+      </w:r>
+      <w:r>
+        <w:rPr>
+          <w:rFonts w:hint="default" w:ascii="TH SarabunPSK" w:hAnsi="TH SarabunPSK" w:cs="TH SarabunPSK"/>
+          <w:sz w:val="32"/>
+          <w:szCs w:val="32"/>
+        </w:rPr>
+        <w:t>BCD Arithmetic Unit</w:t>
+      </w:r>
+    </w:p>
+    <w:p>
+      <w:pPr>
+        <w:ind w:firstLine="720"/>
         <w:rPr>
           <w:rFonts w:hint="default" w:ascii="TH SarabunPSK" w:hAnsi="TH SarabunPSK" w:cs="TH SarabunPSK"/>
           <w:sz w:val="32"/>
           <w:szCs w:val="32"/>
           <w:cs/>
         </w:rPr>
-        <w:t xml:space="preserve">วงจร </w:t>
-      </w:r>
-      <w:r>
-        <w:rPr>
-          <w:rFonts w:hint="default" w:ascii="TH SarabunPSK" w:hAnsi="TH SarabunPSK" w:cs="TH SarabunPSK"/>
-          <w:sz w:val="32"/>
-          <w:szCs w:val="32"/>
-        </w:rPr>
-        <w:t>BCD Arithmetic Unit</w:t>
-      </w:r>
-    </w:p>
-    <w:p>
-      <w:pPr>
-        <w:ind w:firstLine="720"/>
+      </w:pPr>
+      <w:r>
         <w:rPr>
           <w:rFonts w:hint="default" w:ascii="TH SarabunPSK" w:hAnsi="TH SarabunPSK" w:cs="TH SarabunPSK"/>
           <w:sz w:val="32"/>
           <w:szCs w:val="32"/>
           <w:cs/>
         </w:rPr>
-      </w:pPr>
+        <w:t xml:space="preserve">การออกแบบวงจร </w:t>
+      </w:r>
+      <w:r>
+        <w:rPr>
+          <w:rFonts w:hint="default" w:ascii="TH SarabunPSK" w:hAnsi="TH SarabunPSK" w:cs="TH SarabunPSK"/>
+          <w:sz w:val="32"/>
+          <w:szCs w:val="32"/>
+        </w:rPr>
+        <w:t xml:space="preserve">BCD Adder/Sub Tractor </w:t>
+      </w:r>
       <w:r>
         <w:rPr>
           <w:rFonts w:hint="default" w:ascii="TH SarabunPSK" w:hAnsi="TH SarabunPSK" w:cs="TH SarabunPSK"/>
@@ -827,7 +835,7 @@
           <w:szCs w:val="32"/>
           <w:cs/>
         </w:rPr>
-        <w:t xml:space="preserve">การออกแบบวงจร </w:t>
+        <w:t xml:space="preserve">ฐานสิบ </w:t>
       </w:r>
       <w:r>
         <w:rPr>
@@ -835,7 +843,7 @@
           <w:sz w:val="32"/>
           <w:szCs w:val="32"/>
         </w:rPr>
-        <w:t xml:space="preserve">BCD Adder/Sub Tractor </w:t>
+        <w:t>3</w:t>
       </w:r>
       <w:r>
         <w:rPr>
@@ -844,69 +852,69 @@
           <w:szCs w:val="32"/>
           <w:cs/>
         </w:rPr>
-        <w:t xml:space="preserve">ฐานสิบ </w:t>
-      </w:r>
-      <w:r>
+        <w:t xml:space="preserve"> หลัก</w:t>
+      </w:r>
+    </w:p>
+    <w:p>
+      <w:pPr>
+        <w:pStyle w:val="2"/>
         <w:rPr>
           <w:rFonts w:hint="default" w:ascii="TH SarabunPSK" w:hAnsi="TH SarabunPSK" w:cs="TH SarabunPSK"/>
+          <w:b w:val="0"/>
+          <w:bCs w:val="0"/>
           <w:sz w:val="32"/>
           <w:szCs w:val="32"/>
         </w:rPr>
-        <w:t>3</w:t>
-      </w:r>
-      <w:r>
+      </w:pPr>
+      <w:r>
+        <w:rPr>
+          <w:rFonts w:hint="default" w:ascii="TH SarabunPSK" w:hAnsi="TH SarabunPSK" w:cs="TH SarabunPSK"/>
+          <w:b w:val="0"/>
+          <w:bCs w:val="0"/>
+          <w:sz w:val="32"/>
+          <w:szCs w:val="32"/>
+        </w:rPr>
+        <w:t xml:space="preserve">2. </w:t>
+      </w:r>
+      <w:r>
+        <w:rPr>
+          <w:rFonts w:hint="default" w:ascii="TH SarabunPSK" w:hAnsi="TH SarabunPSK" w:cs="TH SarabunPSK"/>
+          <w:b w:val="0"/>
+          <w:bCs w:val="0"/>
+          <w:sz w:val="32"/>
+          <w:szCs w:val="32"/>
+          <w:cs/>
+        </w:rPr>
+        <w:t>จงออกแบบวงจรต่อไปนี้</w:t>
+      </w:r>
+    </w:p>
+    <w:p>
+      <w:pPr>
+        <w:ind w:left="720"/>
         <w:rPr>
           <w:rFonts w:hint="default" w:ascii="TH SarabunPSK" w:hAnsi="TH SarabunPSK" w:cs="TH SarabunPSK"/>
           <w:sz w:val="32"/>
           <w:szCs w:val="32"/>
           <w:cs/>
         </w:rPr>
-        <w:t xml:space="preserve"> หลัก</w:t>
-      </w:r>
-    </w:p>
-    <w:p>
-      <w:pPr>
-        <w:pStyle w:val="2"/>
-        <w:rPr>
-          <w:rFonts w:hint="default" w:ascii="TH SarabunPSK" w:hAnsi="TH SarabunPSK" w:cs="TH SarabunPSK"/>
-          <w:b w:val="0"/>
-          <w:bCs w:val="0"/>
-          <w:sz w:val="32"/>
-          <w:szCs w:val="32"/>
-        </w:rPr>
-      </w:pPr>
-      <w:r>
-        <w:rPr>
-          <w:rFonts w:hint="default" w:ascii="TH SarabunPSK" w:hAnsi="TH SarabunPSK" w:cs="TH SarabunPSK"/>
-          <w:b w:val="0"/>
-          <w:bCs w:val="0"/>
-          <w:sz w:val="32"/>
-          <w:szCs w:val="32"/>
-        </w:rPr>
-        <w:t xml:space="preserve">2. </w:t>
-      </w:r>
-      <w:r>
-        <w:rPr>
-          <w:rFonts w:hint="default" w:ascii="TH SarabunPSK" w:hAnsi="TH SarabunPSK" w:cs="TH SarabunPSK"/>
-          <w:b w:val="0"/>
-          <w:bCs w:val="0"/>
-          <w:sz w:val="32"/>
-          <w:szCs w:val="32"/>
-          <w:cs/>
-        </w:rPr>
-        <w:t>จงออกแบบวงจรต่อไปนี้</w:t>
-      </w:r>
-    </w:p>
-    <w:p>
-      <w:pPr>
-        <w:ind w:left="720"/>
+      </w:pPr>
+      <w:r>
         <w:rPr>
           <w:rFonts w:hint="default" w:ascii="TH SarabunPSK" w:hAnsi="TH SarabunPSK" w:cs="TH SarabunPSK"/>
           <w:sz w:val="32"/>
           <w:szCs w:val="32"/>
           <w:cs/>
         </w:rPr>
-      </w:pPr>
+        <w:t xml:space="preserve">แสดงขั้นตอนการออกแบบวงจร </w:t>
+      </w:r>
+      <w:r>
+        <w:rPr>
+          <w:rFonts w:hint="default" w:ascii="TH SarabunPSK" w:hAnsi="TH SarabunPSK" w:cs="TH SarabunPSK"/>
+          <w:sz w:val="32"/>
+          <w:szCs w:val="32"/>
+        </w:rPr>
+        <w:t xml:space="preserve">BCD Adder/Sub </w:t>
+      </w:r>
       <w:r>
         <w:rPr>
           <w:rFonts w:hint="default" w:ascii="TH SarabunPSK" w:hAnsi="TH SarabunPSK" w:cs="TH SarabunPSK"/>
@@ -914,7 +922,7 @@
           <w:szCs w:val="32"/>
           <w:cs/>
         </w:rPr>
-        <w:t xml:space="preserve">แสดงขั้นตอนการออกแบบวงจร </w:t>
+        <w:t xml:space="preserve">ฐานสิบ </w:t>
       </w:r>
       <w:r>
         <w:rPr>
@@ -922,7 +930,7 @@
           <w:sz w:val="32"/>
           <w:szCs w:val="32"/>
         </w:rPr>
-        <w:t xml:space="preserve">BCD Adder/Sub </w:t>
+        <w:t>3</w:t>
       </w:r>
       <w:r>
         <w:rPr>
@@ -931,7 +939,7 @@
           <w:szCs w:val="32"/>
           <w:cs/>
         </w:rPr>
-        <w:t xml:space="preserve">ฐานสิบ </w:t>
+        <w:t xml:space="preserve"> หลัก</w:t>
       </w:r>
       <w:r>
         <w:rPr>
@@ -939,7 +947,7 @@
           <w:sz w:val="32"/>
           <w:szCs w:val="32"/>
         </w:rPr>
-        <w:t>3</w:t>
+        <w:t xml:space="preserve"> </w:t>
       </w:r>
       <w:r>
         <w:rPr>
@@ -948,7 +956,7 @@
           <w:szCs w:val="32"/>
           <w:cs/>
         </w:rPr>
-        <w:t xml:space="preserve"> หลัก</w:t>
+        <w:t xml:space="preserve">คือ หลักหน่วย </w:t>
       </w:r>
       <w:r>
         <w:rPr>
@@ -956,7 +964,7 @@
           <w:sz w:val="32"/>
           <w:szCs w:val="32"/>
         </w:rPr>
-        <w:t xml:space="preserve"> </w:t>
+        <w:t xml:space="preserve">, </w:t>
       </w:r>
       <w:r>
         <w:rPr>
@@ -965,7 +973,7 @@
           <w:szCs w:val="32"/>
           <w:cs/>
         </w:rPr>
-        <w:t xml:space="preserve">คือ หลักหน่วย </w:t>
+        <w:t xml:space="preserve">หลักสิบและหลักร้อย สามารถใช้ </w:t>
       </w:r>
       <w:r>
         <w:rPr>
@@ -973,7 +981,7 @@
           <w:sz w:val="32"/>
           <w:szCs w:val="32"/>
         </w:rPr>
-        <w:t xml:space="preserve">, </w:t>
+        <w:t xml:space="preserve">MSI IC </w:t>
       </w:r>
       <w:r>
         <w:rPr>
@@ -982,15 +990,27 @@
           <w:szCs w:val="32"/>
           <w:cs/>
         </w:rPr>
-        <w:t xml:space="preserve">หลักสิบและหลักร้อย สามารถใช้ </w:t>
-      </w:r>
-      <w:r>
+        <w:t>ได้</w:t>
+      </w:r>
+    </w:p>
+    <w:p>
+      <w:pPr>
+        <w:tabs>
+          <w:tab w:val="left" w:pos="851"/>
+        </w:tabs>
         <w:rPr>
           <w:rFonts w:hint="default" w:ascii="TH SarabunPSK" w:hAnsi="TH SarabunPSK" w:cs="TH SarabunPSK"/>
           <w:sz w:val="32"/>
           <w:szCs w:val="32"/>
         </w:rPr>
-        <w:t xml:space="preserve">MSI IC </w:t>
+      </w:pPr>
+      <w:r>
+        <w:rPr>
+          <w:rFonts w:hint="default" w:ascii="TH SarabunPSK" w:hAnsi="TH SarabunPSK" w:cs="TH SarabunPSK"/>
+          <w:sz w:val="32"/>
+          <w:szCs w:val="32"/>
+        </w:rPr>
+        <w:t xml:space="preserve">3. </w:t>
       </w:r>
       <w:r>
         <w:rPr>
@@ -999,7 +1019,7 @@
           <w:szCs w:val="32"/>
           <w:cs/>
         </w:rPr>
-        <w:t>ได้</w:t>
+        <w:t>ผลการทดลอง</w:t>
       </w:r>
     </w:p>
     <w:p>
@@ -1019,7 +1039,7 @@
           <w:sz w:val="32"/>
           <w:szCs w:val="32"/>
         </w:rPr>
-        <w:t xml:space="preserve">3. </w:t>
+        <w:t xml:space="preserve">4. </w:t>
       </w:r>
       <w:r>
         <w:rPr>
@@ -1028,45 +1048,7 @@
           <w:szCs w:val="32"/>
           <w:cs/>
         </w:rPr>
-        <w:t>ผลการทดลอง</w:t>
-      </w:r>
-    </w:p>
-    <w:p>
-      <w:pPr>
-        <w:tabs>
-          <w:tab w:val="left" w:pos="851"/>
-        </w:tabs>
-        <w:rPr>
-          <w:rFonts w:hint="default" w:ascii="TH SarabunPSK" w:hAnsi="TH SarabunPSK" w:cs="TH SarabunPSK"/>
-          <w:sz w:val="32"/>
-          <w:szCs w:val="32"/>
-        </w:rPr>
-      </w:pPr>
-      <w:r>
-        <w:rPr>
-          <w:rFonts w:hint="default" w:ascii="TH SarabunPSK" w:hAnsi="TH SarabunPSK" w:cs="TH SarabunPSK"/>
-          <w:sz w:val="32"/>
-          <w:szCs w:val="32"/>
-        </w:rPr>
-        <w:t xml:space="preserve">4. </w:t>
-      </w:r>
-      <w:r>
-        <w:rPr>
-          <w:rFonts w:hint="default" w:ascii="TH SarabunPSK" w:hAnsi="TH SarabunPSK" w:cs="TH SarabunPSK"/>
-          <w:sz w:val="32"/>
-          <w:szCs w:val="32"/>
-          <w:cs/>
-        </w:rPr>
-        <w:t>สรุป</w:t>
-      </w:r>
-      <w:r>
-        <w:rPr>
-          <w:rFonts w:hint="default" w:ascii="TH SarabunPSK" w:hAnsi="TH SarabunPSK" w:cs="TH SarabunPSK"/>
-          <w:sz w:val="32"/>
-          <w:szCs w:val="32"/>
-          <w:cs/>
-        </w:rPr>
-        <w:t>ผลการทดลอง</w:t>
+        <w:t>สรุปผลการทดลอง</w:t>
       </w:r>
     </w:p>
     <w:p>
@@ -1265,8 +1247,6 @@
           <w:szCs w:val="32"/>
         </w:rPr>
       </w:pPr>
-      <w:bookmarkStart w:id="0" w:name="_GoBack"/>
-      <w:bookmarkEnd w:id="0"/>
     </w:p>
     <w:p>
       <w:pPr>
@@ -1306,9 +1286,9 @@
         </w:rPr>
         <w:drawing>
           <wp:inline distT="0" distB="0" distL="114300" distR="114300">
-            <wp:extent cx="8651875" cy="5029200"/>
-            <wp:effectExtent l="0" t="0" r="0" b="15875"/>
-            <wp:docPr id="1" name="Picture 1" descr="lab5circuit"/>
+            <wp:extent cx="8648065" cy="5029200"/>
+            <wp:effectExtent l="0" t="0" r="0" b="635"/>
+            <wp:docPr id="3" name="Picture 3" descr="lab5circuit"/>
             <wp:cNvGraphicFramePr>
               <a:graphicFrameLocks xmlns:a="http://schemas.openxmlformats.org/drawingml/2006/main" noChangeAspect="1"/>
             </wp:cNvGraphicFramePr>
@@ -1316,7 +1296,7 @@
               <a:graphicData uri="http://schemas.openxmlformats.org/drawingml/2006/picture">
                 <pic:pic xmlns:pic="http://schemas.openxmlformats.org/drawingml/2006/picture">
                   <pic:nvPicPr>
-                    <pic:cNvPr id="1" name="Picture 1" descr="lab5circuit"/>
+                    <pic:cNvPr id="3" name="Picture 3" descr="lab5circuit"/>
                     <pic:cNvPicPr>
                       <a:picLocks noChangeAspect="1"/>
                     </pic:cNvPicPr>
@@ -1330,7 +1310,7 @@
                   <pic:spPr>
                     <a:xfrm rot="5400000">
                       <a:off x="0" y="0"/>
-                      <a:ext cx="8651875" cy="5029200"/>
+                      <a:ext cx="8648065" cy="5029200"/>
                     </a:xfrm>
                     <a:prstGeom prst="rect">
                       <a:avLst/>
@@ -1342,6 +1322,8 @@
           </wp:inline>
         </w:drawing>
       </w:r>
+      <w:bookmarkStart w:id="0" w:name="_GoBack"/>
+      <w:bookmarkEnd w:id="0"/>
     </w:p>
     <w:p>
       <w:pPr>
@@ -15144,7 +15126,7 @@
     <w:lsdException w:qFormat="1" w:unhideWhenUsed="0" w:uiPriority="0" w:semiHidden="0" w:name="Title"/>
     <w:lsdException w:unhideWhenUsed="0" w:uiPriority="0" w:semiHidden="0" w:name="Closing"/>
     <w:lsdException w:unhideWhenUsed="0" w:uiPriority="0" w:semiHidden="0" w:name="Signature"/>
-    <w:lsdException w:unhideWhenUsed="0" w:uiPriority="0" w:name="Default Paragraph Font"/>
+    <w:lsdException w:qFormat="1" w:unhideWhenUsed="0" w:uiPriority="0" w:name="Default Paragraph Font"/>
     <w:lsdException w:unhideWhenUsed="0" w:uiPriority="0" w:semiHidden="0" w:name="Body Text"/>
     <w:lsdException w:unhideWhenUsed="0" w:uiPriority="0" w:semiHidden="0" w:name="Body Text Indent"/>
     <w:lsdException w:unhideWhenUsed="0" w:uiPriority="0" w:semiHidden="0" w:name="List Continue"/>
@@ -15378,6 +15360,7 @@
   <w:style w:type="character" w:default="1" w:styleId="4">
     <w:name w:val="Default Paragraph Font"/>
     <w:semiHidden/>
+    <w:qFormat/>
     <w:uiPriority w:val="0"/>
   </w:style>
   <w:style w:type="table" w:default="1" w:styleId="5">

</xml_diff>